<commit_message>
User manual 5.1: default Gemini model and prepaid credits
Note in the Gemini Settings section and FAQ that the default model is
gemini-3.5-flash and that course creation stops with 402 when prepaid
credits run out. Set document author metadata to Metro Systems.

Co-Authored-By: Claude Opus 5.5 <noreply@anthropic.com>
</commit_message>
<xml_diff>
--- a/คู่มือการใช้งาน.docx
+++ b/คู่มือการใช้งาน.docx
@@ -15,13 +15,13 @@
         <w:t>เวอร์ชัน</w:t>
       </w:r>
       <w:r>
-        <w:t>: 5.0</w:t>
+        <w:t>: 5.1</w:t>
       </w:r>
       <w:r>
         <w:t>วันที่อัปเดตล่าสุด</w:t>
       </w:r>
       <w:r>
-        <w:t>: 19 กรกฎาคม 2026</w:t>
+        <w:t>: 12 ตุลาคม 2026</w:t>
       </w:r>
     </w:p>
     <w:p>
@@ -7446,6 +7446,22 @@
         <w:t>Status "Active" หมายถึง model นั้นตอบกลับได้ปกติ</w:t>
       </w:r>
     </w:p>
+    <w:p>
+      <w:pPr>
+        <w:pStyle w:val="ListBullet"/>
+      </w:pPr>
+      <w:r>
+        <w:t>ถ้ายังไม่เคยตั้งค่า model ทุก role ใช้ gemini-3.5-flash เป็นค่าตั้งต้น</w:t>
+      </w:r>
+    </w:p>
+    <w:p>
+      <w:pPr>
+        <w:pStyle w:val="ListBullet"/>
+      </w:pPr>
+      <w:r>
+        <w:t>Gemini API คิดเงินแบบเติมเครดิตล่วงหน้า (Prepay) ถ้าเครดิตหมด ระบบจะสร้างคอร์ส Quiz และ Chat ไม่ได้ และการบันทึก model จะแจ้งว่าเครดิตหมด (402) ให้ผู้ดูแล Google Cloud project เติมเครดิตที่ aistudio.google.com/billing</w:t>
+      </w:r>
+    </w:p>
     <w:p/>
     <w:p>
       <w:r>
@@ -7612,6 +7628,14 @@
       </w:r>
       <w:r>
         <w:t>A: มีผลกับการสร้างคอร์ส/Quiz/Chat ครั้งถัดไป คอร์สที่สร้างไปแล้วไม่เปลี่ยน สามารถตั้งค่า model แยกตาม role ได้ (Planner, Writer, Grader)</w:t>
+      </w:r>
+    </w:p>
+    <w:p>
+      <w:r>
+        <w:t>Q: สร้างคอร์สไม่ได้ และมีข้อความว่าเครดิตหมดหรือ 402?</w:t>
+      </w:r>
+      <w:r>
+        <w:t>A: เครดิต Gemini API (Prepay) ของ project หมด ให้ผู้ดูแล Google Cloud project เติมเครดิตที่ aistudio.google.com/billing หลังเติมเครดิตแล้วใช้งานต่อได้ตามปกติ</w:t>
       </w:r>
     </w:p>
     <w:p>

</xml_diff>